<commit_message>
Deploy preview for PR 1 🛫
</commit_message>
<xml_diff>
--- a/pr-preview/pr-1/vignettes/getting-started.docx
+++ b/pr-preview/pr-1/vignettes/getting-started.docx
@@ -24,7 +24,7 @@
         <w:rPr>
           <w:rStyle w:val="NormalTok"/>
         </w:rPr>
-        <w:t xml:space="preserve">(rpt)</w:t>
+        <w:t xml:space="preserve">(pr.helpers)</w:t>
       </w:r>
     </w:p>
     <w:bookmarkStart w:id="9" w:name="introduction"/>
@@ -50,7 +50,7 @@
         <w:rPr>
           <w:rStyle w:val="VerbatimChar"/>
         </w:rPr>
-        <w:t xml:space="preserve">{rpt}</w:t>
+        <w:t xml:space="preserve">{pr.helpers}</w:t>
       </w:r>
       <w:r>
         <w:t xml:space="preserve"> </w:t>

</xml_diff>